<commit_message>
fix(journal): correct DOI errors in Jurnal_Iman bibliography
- Maulida et al. (2025): corrected URL/DOI to 10.62281/v3i5.1908 (article ID was wrong: /392 -> /1908)
- Pricillia & Zulfachmi (2021): corrected DOI from 10.32722/jbi.v10i1.124 to 10.52771/bangkitindonesia.v10i1.153
- Regenerated Jurnal_Iman.docx with corrected bibliography entries
</commit_message>
<xml_diff>
--- a/journal/Jurnal_Iman.docx
+++ b/journal/Jurnal_Iman.docx
@@ -3590,7 +3590,7 @@
           <w:i w:val="0"/>
           <w:sz w:val="20"/>
         </w:rPr>
-        <w:t>, 3(5). https://mediaakademik.com/index.php/jma/article/view/392</w:t>
+        <w:t>, 3(5). https://doi.org/10.62281/v3i5.1908</w:t>
       </w:r>
     </w:p>
     <w:p>
@@ -3658,7 +3658,7 @@
           <w:i w:val="0"/>
           <w:sz w:val="20"/>
         </w:rPr>
-        <w:t>, 10(1), 6–12. https://doi.org/10.32722/jbi.v10i1.124</w:t>
+        <w:t>, 10(1), 6–12. https://doi.org/10.52771/bangkitindonesia.v10i1.153</w:t>
       </w:r>
     </w:p>
     <w:p>

</xml_diff>